<commit_message>
nmv 30 03 2026
</commit_message>
<xml_diff>
--- a/TS-Kramam/TS-1.7/TS 1.7 Malayalam Krama Paatam Corrections.docx
+++ b/TS-Kramam/TS-1.7/TS 1.7 Malayalam Krama Paatam Corrections.docx
@@ -499,7 +499,7 @@
       </w:tr>
       <w:tr>
         <w:trPr>
-          <w:trHeight w:val="1247"/>
+          <w:trHeight w:val="1393"/>
         </w:trPr>
         <w:tc>
           <w:tcPr>
@@ -518,6 +518,7 @@
               <w:rPr>
                 <w:rFonts w:eastAsia="Times New Roman" w:cs="Arial"/>
                 <w:b/>
+                <w:color w:val="EE0000"/>
                 <w:sz w:val="32"/>
                 <w:szCs w:val="32"/>
                 <w:lang w:val="en-IN" w:eastAsia="en-IN" w:bidi="ml-IN"/>
@@ -527,31 +528,12 @@
               <w:rPr>
                 <w:rFonts w:eastAsia="Times New Roman" w:cs="Arial"/>
                 <w:b/>
+                <w:color w:val="EE0000"/>
                 <w:sz w:val="32"/>
                 <w:szCs w:val="32"/>
                 <w:lang w:val="en-IN" w:eastAsia="en-IN" w:bidi="ml-IN"/>
               </w:rPr>
-              <w:t>T.S.1.7.</w:t>
-            </w:r>
-            <w:r>
-              <w:rPr>
-                <w:rFonts w:eastAsia="Times New Roman" w:cs="Arial"/>
-                <w:b/>
-                <w:sz w:val="32"/>
-                <w:szCs w:val="32"/>
-                <w:lang w:val="en-IN" w:eastAsia="en-IN" w:bidi="ml-IN"/>
-              </w:rPr>
-              <w:t>2.1</w:t>
-            </w:r>
-            <w:r>
-              <w:rPr>
-                <w:rFonts w:eastAsia="Times New Roman" w:cs="Arial"/>
-                <w:b/>
-                <w:sz w:val="32"/>
-                <w:szCs w:val="32"/>
-                <w:lang w:val="en-IN" w:eastAsia="en-IN" w:bidi="ml-IN"/>
-              </w:rPr>
-              <w:t xml:space="preserve"> - Kramam</w:t>
+              <w:t>T.S.1.7.1.2 - Kramam</w:t>
             </w:r>
           </w:p>
           <w:p>
@@ -565,6 +547,7 @@
                 <w:rFonts w:cs="Arial"/>
                 <w:b/>
                 <w:bCs/>
+                <w:color w:val="EE0000"/>
                 <w:sz w:val="28"/>
                 <w:szCs w:val="36"/>
                 <w:lang w:val="en-IN" w:bidi="ml-IN"/>
@@ -575,11 +558,12 @@
                 <w:rFonts w:cs="Arial"/>
                 <w:b/>
                 <w:bCs/>
+                <w:color w:val="EE0000"/>
                 <w:sz w:val="28"/>
                 <w:szCs w:val="36"/>
                 <w:lang w:val="en-IN" w:bidi="ml-IN"/>
               </w:rPr>
-              <w:t>Krama Vaakyam No. 20</w:t>
+              <w:t>Krama Vaakyam No. 36</w:t>
             </w:r>
           </w:p>
           <w:p>
@@ -595,6 +579,7 @@
               <w:rPr>
                 <w:rFonts w:eastAsia="Times New Roman" w:cs="Arial"/>
                 <w:b/>
+                <w:color w:val="EE0000"/>
                 <w:sz w:val="32"/>
                 <w:szCs w:val="32"/>
                 <w:lang w:val="it-IT" w:eastAsia="en-IN" w:bidi="ml-IN"/>
@@ -605,11 +590,12 @@
                 <w:rFonts w:cs="Arial"/>
                 <w:b/>
                 <w:bCs/>
+                <w:color w:val="EE0000"/>
                 <w:sz w:val="28"/>
                 <w:szCs w:val="36"/>
                 <w:lang w:val="it-IT" w:bidi="ml-IN"/>
               </w:rPr>
-              <w:t>Panchaati No. 7</w:t>
+              <w:t>Panchaati No. 2</w:t>
             </w:r>
           </w:p>
         </w:tc>
@@ -623,55 +609,94 @@
               <w:autoSpaceDE w:val="0"/>
               <w:autoSpaceDN w:val="0"/>
               <w:adjustRightInd w:val="0"/>
-              <w:spacing w:before="0" w:line="252" w:lineRule="auto"/>
-              <w:rPr>
-                <w:rFonts w:ascii="BRH Malayalam Extra" w:hAnsi="BRH Malayalam Extra" w:cs="BRH Malayalam Extra"/>
-                <w:sz w:val="40"/>
-                <w:szCs w:val="40"/>
-                <w:lang w:val="en-IN"/>
-              </w:rPr>
-            </w:pPr>
-            <w:r>
-              <w:rPr>
-                <w:rFonts w:ascii="BRH Malayalam Extra" w:hAnsi="BRH Malayalam Extra" w:cs="BRH Malayalam Extra"/>
-                <w:sz w:val="40"/>
-                <w:szCs w:val="40"/>
-              </w:rPr>
-              <w:t xml:space="preserve">Dex˜¥tû | </w:t>
-            </w:r>
-            <w:r>
-              <w:rPr>
-                <w:rFonts w:ascii="BRH Malayalam Extra" w:hAnsi="BRH Malayalam Extra" w:cs="BRH Malayalam Extra"/>
+              <w:spacing w:before="0" w:line="240" w:lineRule="auto"/>
+              <w:rPr>
+                <w:rFonts w:ascii="BRH Malayalam Extra" w:hAnsi="BRH Malayalam Extra" w:cs="BRH Malayalam Extra"/>
+                <w:color w:val="EE0000"/>
+                <w:sz w:val="40"/>
+                <w:szCs w:val="40"/>
+              </w:rPr>
+            </w:pPr>
+            <w:r>
+              <w:rPr>
+                <w:rFonts w:ascii="BRH Malayalam Extra" w:hAnsi="BRH Malayalam Extra" w:cs="BRH Malayalam Extra"/>
+                <w:color w:val="EE0000"/>
+                <w:sz w:val="40"/>
+                <w:szCs w:val="40"/>
+              </w:rPr>
+              <w:t>C¥Wxe—</w:t>
+            </w:r>
+            <w:r>
+              <w:rPr>
+                <w:rFonts w:ascii="BRH Malayalam Extra" w:hAnsi="BRH Malayalam Extra" w:cs="BRH Malayalam Extra"/>
+                <w:color w:val="EE0000"/>
                 <w:sz w:val="40"/>
                 <w:szCs w:val="40"/>
                 <w:highlight w:val="yellow"/>
               </w:rPr>
-              <w:t>A</w:t>
-            </w:r>
-            <w:r>
-              <w:rPr>
-                <w:rFonts w:ascii="BRH Malayalam Extra" w:hAnsi="BRH Malayalam Extra" w:cs="BRH Malayalam Extra"/>
-                <w:sz w:val="40"/>
-                <w:szCs w:val="40"/>
-              </w:rPr>
-              <w:t>tû</w:t>
-            </w:r>
-            <w:r>
-              <w:rPr>
-                <w:rFonts w:ascii="BRH Malayalam Extra" w:hAnsi="BRH Malayalam Extra" w:cs="BRH Malayalam Extra"/>
-                <w:b/>
-                <w:sz w:val="32"/>
-                <w:szCs w:val="40"/>
-              </w:rPr>
-              <w:t>–</w:t>
-            </w:r>
-            <w:r>
-              <w:rPr>
-                <w:rFonts w:ascii="BRH Malayalam Extra" w:hAnsi="BRH Malayalam Extra" w:cs="BRH Malayalam Extra"/>
-                <w:sz w:val="40"/>
-                <w:szCs w:val="40"/>
-              </w:rPr>
-              <w:t xml:space="preserve"> CZy— |</w:t>
+              <w:t>t¢</w:t>
+            </w:r>
+            <w:r>
+              <w:rPr>
+                <w:rFonts w:ascii="BRH Malayalam Extra" w:hAnsi="BRH Malayalam Extra" w:cs="BRH Malayalam Extra"/>
+                <w:b/>
+                <w:color w:val="EE0000"/>
+                <w:sz w:val="32"/>
+                <w:szCs w:val="40"/>
+              </w:rPr>
+              <w:t>–</w:t>
+            </w:r>
+            <w:r>
+              <w:rPr>
+                <w:rFonts w:ascii="BRH Malayalam Extra" w:hAnsi="BRH Malayalam Extra" w:cs="BRH Malayalam Extra"/>
+                <w:color w:val="EE0000"/>
+                <w:sz w:val="40"/>
+                <w:szCs w:val="40"/>
+              </w:rPr>
+              <w:t xml:space="preserve">Zx | </w:t>
+            </w:r>
+          </w:p>
+          <w:p>
+            <w:pPr>
+              <w:widowControl w:val="0"/>
+              <w:autoSpaceDE w:val="0"/>
+              <w:autoSpaceDN w:val="0"/>
+              <w:adjustRightInd w:val="0"/>
+              <w:spacing w:before="0" w:line="240" w:lineRule="auto"/>
+              <w:rPr>
+                <w:rFonts w:ascii="BRH Devanagari Extra" w:hAnsi="BRH Devanagari Extra" w:cs="BRH Devanagari Extra"/>
+                <w:color w:val="EE0000"/>
+                <w:sz w:val="40"/>
+                <w:szCs w:val="40"/>
+              </w:rPr>
+            </w:pPr>
+            <w:r>
+              <w:rPr>
+                <w:rFonts w:ascii="BRH Malayalam Extra" w:hAnsi="BRH Malayalam Extra" w:cs="BRH Malayalam Extra"/>
+                <w:color w:val="EE0000"/>
+                <w:sz w:val="40"/>
+                <w:szCs w:val="40"/>
+              </w:rPr>
+              <w:t>De—t¢</w:t>
+            </w:r>
+            <w:r>
+              <w:rPr>
+                <w:rFonts w:ascii="BRH Malayalam Extra" w:hAnsi="BRH Malayalam Extra" w:cs="BRH Malayalam Extra"/>
+                <w:b/>
+                <w:color w:val="EE0000"/>
+                <w:sz w:val="32"/>
+                <w:szCs w:val="40"/>
+              </w:rPr>
+              <w:t>–</w:t>
+            </w:r>
+            <w:r>
+              <w:rPr>
+                <w:rFonts w:ascii="BRH Malayalam Extra" w:hAnsi="BRH Malayalam Extra" w:cs="BRH Malayalam Extra"/>
+                <w:color w:val="EE0000"/>
+                <w:sz w:val="40"/>
+                <w:szCs w:val="40"/>
+              </w:rPr>
+              <w:t xml:space="preserve">¥ZZy— | </w:t>
             </w:r>
           </w:p>
         </w:tc>
@@ -685,64 +710,84 @@
               <w:autoSpaceDE w:val="0"/>
               <w:autoSpaceDN w:val="0"/>
               <w:adjustRightInd w:val="0"/>
-              <w:spacing w:before="0" w:line="252" w:lineRule="auto"/>
-              <w:rPr>
-                <w:rFonts w:ascii="BRH Malayalam Extra" w:hAnsi="BRH Malayalam Extra" w:cs="BRH Malayalam Extra"/>
-                <w:sz w:val="40"/>
-                <w:szCs w:val="40"/>
-                <w:lang w:val="en-IN"/>
-              </w:rPr>
-            </w:pPr>
-            <w:r>
-              <w:rPr>
-                <w:rFonts w:ascii="BRH Malayalam Extra" w:hAnsi="BRH Malayalam Extra" w:cs="BRH Malayalam Extra"/>
-                <w:sz w:val="40"/>
-                <w:szCs w:val="40"/>
-              </w:rPr>
-              <w:t xml:space="preserve">Dex˜¥tû | </w:t>
-            </w:r>
-            <w:r>
-              <w:rPr>
-                <w:rFonts w:ascii="BRH Malayalam Extra" w:hAnsi="BRH Malayalam Extra" w:cs="BRH Malayalam Extra"/>
+              <w:spacing w:before="0" w:line="240" w:lineRule="auto"/>
+              <w:rPr>
+                <w:rFonts w:ascii="BRH Malayalam Extra" w:hAnsi="BRH Malayalam Extra" w:cs="BRH Malayalam Extra"/>
+                <w:color w:val="EE0000"/>
+                <w:sz w:val="40"/>
+                <w:szCs w:val="40"/>
+              </w:rPr>
+            </w:pPr>
+            <w:r>
+              <w:rPr>
+                <w:rFonts w:ascii="BRH Malayalam Extra" w:hAnsi="BRH Malayalam Extra" w:cs="BRH Malayalam Extra"/>
+                <w:color w:val="EE0000"/>
+                <w:sz w:val="40"/>
+                <w:szCs w:val="40"/>
+              </w:rPr>
+              <w:t>C¥Wxe</w:t>
+            </w:r>
+            <w:r>
+              <w:rPr>
+                <w:rFonts w:ascii="BRH Malayalam Extra" w:hAnsi="BRH Malayalam Extra" w:cs="BRH Malayalam Extra"/>
+                <w:color w:val="EE0000"/>
                 <w:sz w:val="40"/>
                 <w:szCs w:val="40"/>
                 <w:highlight w:val="green"/>
               </w:rPr>
-              <w:t>A</w:t>
-            </w:r>
-            <w:r>
-              <w:rPr>
-                <w:rFonts w:ascii="BRH Malayalam Extra" w:hAnsi="BRH Malayalam Extra" w:cs="BRH Malayalam Extra"/>
-                <w:b/>
-                <w:sz w:val="32"/>
-                <w:szCs w:val="40"/>
-              </w:rPr>
-              <w:t>–</w:t>
-            </w:r>
-            <w:r>
-              <w:rPr>
-                <w:rFonts w:ascii="BRH Malayalam Extra" w:hAnsi="BRH Malayalam Extra" w:cs="BRH Malayalam Extra"/>
-                <w:sz w:val="40"/>
-                <w:szCs w:val="40"/>
-              </w:rPr>
-              <w:t>tû</w:t>
-            </w:r>
-            <w:r>
-              <w:rPr>
-                <w:rFonts w:ascii="BRH Malayalam Extra" w:hAnsi="BRH Malayalam Extra" w:cs="BRH Malayalam Extra"/>
-                <w:b/>
-                <w:sz w:val="32"/>
-                <w:szCs w:val="40"/>
-              </w:rPr>
-              <w:t>–</w:t>
-            </w:r>
-            <w:r>
-              <w:rPr>
-                <w:rFonts w:ascii="BRH Malayalam Extra" w:hAnsi="BRH Malayalam Extra" w:cs="BRH Malayalam Extra"/>
-                <w:sz w:val="40"/>
-                <w:szCs w:val="40"/>
-              </w:rPr>
-              <w:t xml:space="preserve"> CZy— |</w:t>
+              <w:t>—t¢</w:t>
+            </w:r>
+            <w:r>
+              <w:rPr>
+                <w:rFonts w:ascii="BRH Malayalam Extra" w:hAnsi="BRH Malayalam Extra" w:cs="BRH Malayalam Extra"/>
+                <w:color w:val="EE0000"/>
+                <w:sz w:val="40"/>
+                <w:szCs w:val="40"/>
+              </w:rPr>
+              <w:t xml:space="preserve">Zx | </w:t>
+            </w:r>
+          </w:p>
+          <w:p>
+            <w:pPr>
+              <w:widowControl w:val="0"/>
+              <w:autoSpaceDE w:val="0"/>
+              <w:autoSpaceDN w:val="0"/>
+              <w:adjustRightInd w:val="0"/>
+              <w:spacing w:before="0" w:line="240" w:lineRule="auto"/>
+              <w:rPr>
+                <w:rFonts w:ascii="BRH Devanagari Extra" w:hAnsi="BRH Devanagari Extra" w:cs="BRH Devanagari Extra"/>
+                <w:color w:val="EE0000"/>
+                <w:sz w:val="40"/>
+                <w:szCs w:val="40"/>
+              </w:rPr>
+            </w:pPr>
+            <w:r>
+              <w:rPr>
+                <w:rFonts w:ascii="BRH Malayalam Extra" w:hAnsi="BRH Malayalam Extra" w:cs="BRH Malayalam Extra"/>
+                <w:color w:val="EE0000"/>
+                <w:sz w:val="40"/>
+                <w:szCs w:val="40"/>
+              </w:rPr>
+              <w:t>De—t¢</w:t>
+            </w:r>
+            <w:r>
+              <w:rPr>
+                <w:rFonts w:ascii="BRH Malayalam Extra" w:hAnsi="BRH Malayalam Extra" w:cs="BRH Malayalam Extra"/>
+                <w:b/>
+                <w:color w:val="EE0000"/>
+                <w:sz w:val="32"/>
+                <w:szCs w:val="40"/>
+              </w:rPr>
+              <w:t>–</w:t>
+            </w:r>
+            <w:r>
+              <w:rPr>
+                <w:rFonts w:ascii="BRH Malayalam Extra" w:hAnsi="BRH Malayalam Extra" w:cs="BRH Malayalam Extra"/>
+                <w:color w:val="EE0000"/>
+                <w:sz w:val="40"/>
+                <w:szCs w:val="40"/>
+              </w:rPr>
+              <w:t>¥ZZy— |</w:t>
             </w:r>
           </w:p>
         </w:tc>
@@ -791,6 +836,256 @@
                 <w:szCs w:val="32"/>
                 <w:lang w:val="en-IN" w:eastAsia="en-IN" w:bidi="ml-IN"/>
               </w:rPr>
+              <w:t>2.1</w:t>
+            </w:r>
+            <w:r>
+              <w:rPr>
+                <w:rFonts w:eastAsia="Times New Roman" w:cs="Arial"/>
+                <w:b/>
+                <w:sz w:val="32"/>
+                <w:szCs w:val="32"/>
+                <w:lang w:val="en-IN" w:eastAsia="en-IN" w:bidi="ml-IN"/>
+              </w:rPr>
+              <w:t xml:space="preserve"> - Kramam</w:t>
+            </w:r>
+          </w:p>
+          <w:p>
+            <w:pPr>
+              <w:widowControl w:val="0"/>
+              <w:autoSpaceDE w:val="0"/>
+              <w:autoSpaceDN w:val="0"/>
+              <w:adjustRightInd w:val="0"/>
+              <w:spacing w:before="0" w:line="240" w:lineRule="auto"/>
+              <w:rPr>
+                <w:rFonts w:cs="Arial"/>
+                <w:b/>
+                <w:bCs/>
+                <w:sz w:val="28"/>
+                <w:szCs w:val="36"/>
+                <w:lang w:val="en-IN" w:bidi="ml-IN"/>
+              </w:rPr>
+            </w:pPr>
+            <w:r>
+              <w:rPr>
+                <w:rFonts w:cs="Arial"/>
+                <w:b/>
+                <w:bCs/>
+                <w:sz w:val="28"/>
+                <w:szCs w:val="36"/>
+                <w:lang w:val="en-IN" w:bidi="ml-IN"/>
+              </w:rPr>
+              <w:t>Krama Vaakyam No. 20</w:t>
+            </w:r>
+          </w:p>
+          <w:p>
+            <w:pPr>
+              <w:widowControl w:val="0"/>
+              <w:tabs>
+                <w:tab w:val="left" w:pos="993"/>
+              </w:tabs>
+              <w:autoSpaceDE w:val="0"/>
+              <w:autoSpaceDN w:val="0"/>
+              <w:adjustRightInd w:val="0"/>
+              <w:spacing w:before="0" w:line="240" w:lineRule="auto"/>
+              <w:rPr>
+                <w:rFonts w:eastAsia="Times New Roman" w:cs="Arial"/>
+                <w:b/>
+                <w:sz w:val="32"/>
+                <w:szCs w:val="32"/>
+                <w:lang w:val="it-IT" w:eastAsia="en-IN" w:bidi="ml-IN"/>
+              </w:rPr>
+            </w:pPr>
+            <w:r>
+              <w:rPr>
+                <w:rFonts w:cs="Arial"/>
+                <w:b/>
+                <w:bCs/>
+                <w:sz w:val="28"/>
+                <w:szCs w:val="36"/>
+                <w:lang w:val="it-IT" w:bidi="ml-IN"/>
+              </w:rPr>
+              <w:t>Panchaati No. 7</w:t>
+            </w:r>
+          </w:p>
+        </w:tc>
+        <w:tc>
+          <w:tcPr>
+            <w:tcW w:w="5196" w:type="dxa"/>
+          </w:tcPr>
+          <w:p>
+            <w:pPr>
+              <w:widowControl w:val="0"/>
+              <w:autoSpaceDE w:val="0"/>
+              <w:autoSpaceDN w:val="0"/>
+              <w:adjustRightInd w:val="0"/>
+              <w:spacing w:before="0" w:line="252" w:lineRule="auto"/>
+              <w:rPr>
+                <w:rFonts w:ascii="BRH Malayalam Extra" w:hAnsi="BRH Malayalam Extra" w:cs="BRH Malayalam Extra"/>
+                <w:sz w:val="40"/>
+                <w:szCs w:val="40"/>
+                <w:lang w:val="en-IN"/>
+              </w:rPr>
+            </w:pPr>
+            <w:r>
+              <w:rPr>
+                <w:rFonts w:ascii="BRH Malayalam Extra" w:hAnsi="BRH Malayalam Extra" w:cs="BRH Malayalam Extra"/>
+                <w:sz w:val="40"/>
+                <w:szCs w:val="40"/>
+              </w:rPr>
+              <w:t xml:space="preserve">Dex˜¥tû | </w:t>
+            </w:r>
+            <w:r>
+              <w:rPr>
+                <w:rFonts w:ascii="BRH Malayalam Extra" w:hAnsi="BRH Malayalam Extra" w:cs="BRH Malayalam Extra"/>
+                <w:sz w:val="40"/>
+                <w:szCs w:val="40"/>
+                <w:highlight w:val="yellow"/>
+              </w:rPr>
+              <w:t>A</w:t>
+            </w:r>
+            <w:r>
+              <w:rPr>
+                <w:rFonts w:ascii="BRH Malayalam Extra" w:hAnsi="BRH Malayalam Extra" w:cs="BRH Malayalam Extra"/>
+                <w:sz w:val="40"/>
+                <w:szCs w:val="40"/>
+              </w:rPr>
+              <w:t>tû</w:t>
+            </w:r>
+            <w:r>
+              <w:rPr>
+                <w:rFonts w:ascii="BRH Malayalam Extra" w:hAnsi="BRH Malayalam Extra" w:cs="BRH Malayalam Extra"/>
+                <w:b/>
+                <w:sz w:val="32"/>
+                <w:szCs w:val="40"/>
+              </w:rPr>
+              <w:t>–</w:t>
+            </w:r>
+            <w:r>
+              <w:rPr>
+                <w:rFonts w:ascii="BRH Malayalam Extra" w:hAnsi="BRH Malayalam Extra" w:cs="BRH Malayalam Extra"/>
+                <w:sz w:val="40"/>
+                <w:szCs w:val="40"/>
+              </w:rPr>
+              <w:t xml:space="preserve"> CZy— |</w:t>
+            </w:r>
+          </w:p>
+        </w:tc>
+        <w:tc>
+          <w:tcPr>
+            <w:tcW w:w="5152" w:type="dxa"/>
+          </w:tcPr>
+          <w:p>
+            <w:pPr>
+              <w:widowControl w:val="0"/>
+              <w:autoSpaceDE w:val="0"/>
+              <w:autoSpaceDN w:val="0"/>
+              <w:adjustRightInd w:val="0"/>
+              <w:spacing w:before="0" w:line="252" w:lineRule="auto"/>
+              <w:rPr>
+                <w:rFonts w:ascii="BRH Malayalam Extra" w:hAnsi="BRH Malayalam Extra" w:cs="BRH Malayalam Extra"/>
+                <w:sz w:val="40"/>
+                <w:szCs w:val="40"/>
+                <w:lang w:val="en-IN"/>
+              </w:rPr>
+            </w:pPr>
+            <w:r>
+              <w:rPr>
+                <w:rFonts w:ascii="BRH Malayalam Extra" w:hAnsi="BRH Malayalam Extra" w:cs="BRH Malayalam Extra"/>
+                <w:sz w:val="40"/>
+                <w:szCs w:val="40"/>
+              </w:rPr>
+              <w:t xml:space="preserve">Dex˜¥tû | </w:t>
+            </w:r>
+            <w:r>
+              <w:rPr>
+                <w:rFonts w:ascii="BRH Malayalam Extra" w:hAnsi="BRH Malayalam Extra" w:cs="BRH Malayalam Extra"/>
+                <w:sz w:val="40"/>
+                <w:szCs w:val="40"/>
+                <w:highlight w:val="green"/>
+              </w:rPr>
+              <w:t>A</w:t>
+            </w:r>
+            <w:r>
+              <w:rPr>
+                <w:rFonts w:ascii="BRH Malayalam Extra" w:hAnsi="BRH Malayalam Extra" w:cs="BRH Malayalam Extra"/>
+                <w:b/>
+                <w:sz w:val="32"/>
+                <w:szCs w:val="40"/>
+              </w:rPr>
+              <w:t>–</w:t>
+            </w:r>
+            <w:r>
+              <w:rPr>
+                <w:rFonts w:ascii="BRH Malayalam Extra" w:hAnsi="BRH Malayalam Extra" w:cs="BRH Malayalam Extra"/>
+                <w:sz w:val="40"/>
+                <w:szCs w:val="40"/>
+              </w:rPr>
+              <w:t>tû</w:t>
+            </w:r>
+            <w:r>
+              <w:rPr>
+                <w:rFonts w:ascii="BRH Malayalam Extra" w:hAnsi="BRH Malayalam Extra" w:cs="BRH Malayalam Extra"/>
+                <w:b/>
+                <w:sz w:val="32"/>
+                <w:szCs w:val="40"/>
+              </w:rPr>
+              <w:t>–</w:t>
+            </w:r>
+            <w:r>
+              <w:rPr>
+                <w:rFonts w:ascii="BRH Malayalam Extra" w:hAnsi="BRH Malayalam Extra" w:cs="BRH Malayalam Extra"/>
+                <w:sz w:val="40"/>
+                <w:szCs w:val="40"/>
+              </w:rPr>
+              <w:t xml:space="preserve"> CZy— |</w:t>
+            </w:r>
+          </w:p>
+        </w:tc>
+      </w:tr>
+      <w:tr>
+        <w:trPr>
+          <w:trHeight w:val="1247"/>
+        </w:trPr>
+        <w:tc>
+          <w:tcPr>
+            <w:tcW w:w="3686" w:type="dxa"/>
+          </w:tcPr>
+          <w:p>
+            <w:pPr>
+              <w:widowControl w:val="0"/>
+              <w:tabs>
+                <w:tab w:val="left" w:pos="993"/>
+              </w:tabs>
+              <w:autoSpaceDE w:val="0"/>
+              <w:autoSpaceDN w:val="0"/>
+              <w:adjustRightInd w:val="0"/>
+              <w:spacing w:before="0" w:line="240" w:lineRule="auto"/>
+              <w:rPr>
+                <w:rFonts w:eastAsia="Times New Roman" w:cs="Arial"/>
+                <w:b/>
+                <w:sz w:val="32"/>
+                <w:szCs w:val="32"/>
+                <w:lang w:val="en-IN" w:eastAsia="en-IN" w:bidi="ml-IN"/>
+              </w:rPr>
+            </w:pPr>
+            <w:r>
+              <w:rPr>
+                <w:rFonts w:eastAsia="Times New Roman" w:cs="Arial"/>
+                <w:b/>
+                <w:sz w:val="32"/>
+                <w:szCs w:val="32"/>
+                <w:lang w:val="en-IN" w:eastAsia="en-IN" w:bidi="ml-IN"/>
+              </w:rPr>
+              <w:t>T.S.1.7.</w:t>
+            </w:r>
+            <w:r>
+              <w:rPr>
+                <w:rFonts w:eastAsia="Times New Roman" w:cs="Arial"/>
+                <w:b/>
+                <w:sz w:val="32"/>
+                <w:szCs w:val="32"/>
+                <w:lang w:val="en-IN" w:eastAsia="en-IN" w:bidi="ml-IN"/>
+              </w:rPr>
               <w:t>3.4</w:t>
             </w:r>
             <w:r>
@@ -1689,6 +1984,7 @@
                 <w:szCs w:val="32"/>
                 <w:lang w:val="en-IN" w:eastAsia="en-IN" w:bidi="ml-IN"/>
               </w:rPr>
+              <w:lastRenderedPageBreak/>
               <w:t>T.S.1.7.</w:t>
             </w:r>
             <w:r>
@@ -2125,7 +2421,6 @@
                 <w:szCs w:val="32"/>
                 <w:lang w:val="en-IN" w:eastAsia="en-IN" w:bidi="ml-IN"/>
               </w:rPr>
-              <w:lastRenderedPageBreak/>
               <w:t>T.S.1.7.</w:t>
             </w:r>
             <w:r>
@@ -3331,6 +3626,7 @@
                 <w:szCs w:val="32"/>
                 <w:lang w:val="en-IN" w:eastAsia="en-IN" w:bidi="ml-IN"/>
               </w:rPr>
+              <w:lastRenderedPageBreak/>
               <w:t>T.S.1.7.</w:t>
             </w:r>
             <w:r>
@@ -3741,7 +4037,6 @@
           <w:szCs w:val="32"/>
           <w:u w:val="single"/>
         </w:rPr>
-        <w:lastRenderedPageBreak/>
         <w:t xml:space="preserve">Krama </w:t>
       </w:r>
       <w:r>
@@ -5046,6 +5341,7 @@
                 <w:szCs w:val="32"/>
                 <w:lang w:val="en-IN" w:eastAsia="en-IN" w:bidi="ml-IN"/>
               </w:rPr>
+              <w:lastRenderedPageBreak/>
               <w:t>T.S.1.7.1.4 - Kramam</w:t>
             </w:r>
           </w:p>
@@ -5423,7 +5719,6 @@
                 <w:szCs w:val="32"/>
                 <w:lang w:val="en-IN" w:eastAsia="en-IN" w:bidi="ml-IN"/>
               </w:rPr>
-              <w:lastRenderedPageBreak/>
               <w:t>T.S.1.7.1.6 - Kramam</w:t>
             </w:r>
           </w:p>
@@ -7317,6 +7612,7 @@
                 <w:szCs w:val="32"/>
                 <w:lang w:val="en-IN" w:eastAsia="en-IN" w:bidi="ml-IN"/>
               </w:rPr>
+              <w:lastRenderedPageBreak/>
               <w:t>T.S.1.7.8.3 - Kramam</w:t>
             </w:r>
           </w:p>
@@ -7910,7 +8206,6 @@
                 <w:sz w:val="40"/>
                 <w:szCs w:val="40"/>
               </w:rPr>
-              <w:lastRenderedPageBreak/>
               <w:t>sy</w:t>
             </w:r>
             <w:r>
@@ -7997,7 +8292,6 @@
                 <w:sz w:val="40"/>
                 <w:szCs w:val="40"/>
               </w:rPr>
-              <w:lastRenderedPageBreak/>
               <w:t>A</w:t>
             </w:r>
             <w:r>
@@ -8049,7 +8343,6 @@
                 <w:sz w:val="40"/>
                 <w:szCs w:val="40"/>
               </w:rPr>
-              <w:lastRenderedPageBreak/>
               <w:t>sy</w:t>
             </w:r>
             <w:r>
@@ -8138,7 +8431,6 @@
                 <w:szCs w:val="32"/>
                 <w:lang w:val="en-IN" w:eastAsia="en-IN" w:bidi="ml-IN"/>
               </w:rPr>
-              <w:lastRenderedPageBreak/>
               <w:t>T.S.1.7.1</w:t>
             </w:r>
             <w:r>
@@ -9152,6 +9444,7 @@
                 <w:szCs w:val="32"/>
                 <w:lang w:val="en-IN" w:eastAsia="en-IN" w:bidi="ml-IN"/>
               </w:rPr>
+              <w:lastRenderedPageBreak/>
               <w:t>T.S.1.7.4.1</w:t>
             </w:r>
             <w:r>
@@ -9629,7 +9922,6 @@
                 <w:szCs w:val="32"/>
                 <w:lang w:val="en-IN" w:eastAsia="en-IN" w:bidi="ml-IN"/>
               </w:rPr>
-              <w:lastRenderedPageBreak/>
               <w:t>T.S.1.7.6.3</w:t>
             </w:r>
             <w:r>
@@ -11599,7 +11891,6 @@
           <w:szCs w:val="32"/>
           <w:u w:val="single"/>
         </w:rPr>
-        <w:lastRenderedPageBreak/>
         <w:t xml:space="preserve">TS </w:t>
       </w:r>
       <w:r>

</xml_diff>